<commit_message>
docs: finalize interface correction report equations and latest evidence status
</commit_message>
<xml_diff>
--- a/docs/research/reviewer-interface-v4/final-update.docx
+++ b/docs/research/reviewer-interface-v4/final-update.docx
@@ -40,6 +40,674 @@
       </w:r>
       <w:r>
         <w:t xml:space="preserve">One predefined controller variant separates freshness eligibility from authority: a valid packet younger than 50 ms may receive up to 0.25 authority, with the existing 0.05/tick ramp,0.3 s residual filter, three-good-control-tick recovery,1 s nominal predictor and 0.1% predicted-cost improvement test. Invalid/stale packets immediately revoke assistance. This is an empirical performance supervisor, not a formal safety certificate.</w:t>
+      </w:r>
+      <w:r>
+        <w:t xml:space="preserve"> </w:t>
+      </w:r>
+      <w:r>
+        <w:t xml:space="preserve">For a valid packet,</w:t>
+      </w:r>
+      <w:r>
+        <w:t xml:space="preserve"> </w:t>
+      </w:r>
+      <m:oMath>
+        <m:sSub>
+          <m:e>
+            <m:r>
+              <m:t>f</m:t>
+            </m:r>
+          </m:e>
+          <m:sub>
+            <m:r>
+              <m:t>t</m:t>
+            </m:r>
+          </m:sub>
+        </m:sSub>
+        <m:r>
+          <m:rPr>
+            <m:sty m:val="p"/>
+          </m:rPr>
+          <m:t>=</m:t>
+        </m:r>
+        <m:sSub>
+          <m:e>
+            <m:r>
+              <m:t>f</m:t>
+            </m:r>
+          </m:e>
+          <m:sub>
+            <m:r>
+              <m:t>t</m:t>
+            </m:r>
+            <m:r>
+              <m:rPr>
+                <m:sty m:val="p"/>
+              </m:rPr>
+              <m:t>−</m:t>
+            </m:r>
+            <m:r>
+              <m:t>1</m:t>
+            </m:r>
+          </m:sub>
+        </m:sSub>
+        <m:r>
+          <m:rPr>
+            <m:sty m:val="p"/>
+          </m:rPr>
+          <m:t>+</m:t>
+        </m:r>
+        <m:r>
+          <m:t>α</m:t>
+        </m:r>
+        <m:d>
+          <m:dPr>
+            <m:begChr m:val="["/>
+            <m:endChr m:val="]"/>
+            <m:sepChr m:val=""/>
+            <m:grow/>
+          </m:dPr>
+          <m:e>
+            <m:r>
+              <m:rPr>
+                <m:sty m:val="p"/>
+              </m:rPr>
+              <m:t>clip</m:t>
+            </m:r>
+            <m:d>
+              <m:dPr>
+                <m:begChr m:val="("/>
+                <m:endChr m:val=")"/>
+                <m:sepChr m:val=""/>
+                <m:grow/>
+              </m:dPr>
+              <m:e>
+                <m:r>
+                  <m:t>Δ</m:t>
+                </m:r>
+                <m:sSub>
+                  <m:e>
+                    <m:r>
+                      <m:t>δ</m:t>
+                    </m:r>
+                  </m:e>
+                  <m:sub>
+                    <m:r>
+                      <m:t>t</m:t>
+                    </m:r>
+                  </m:sub>
+                </m:sSub>
+                <m:r>
+                  <m:rPr>
+                    <m:sty m:val="p"/>
+                  </m:rPr>
+                  <m:t>,</m:t>
+                </m:r>
+                <m:r>
+                  <m:rPr>
+                    <m:sty m:val="p"/>
+                  </m:rPr>
+                  <m:t>−</m:t>
+                </m:r>
+                <m:r>
+                  <m:t>0.08</m:t>
+                </m:r>
+                <m:r>
+                  <m:rPr>
+                    <m:sty m:val="p"/>
+                  </m:rPr>
+                  <m:t>,</m:t>
+                </m:r>
+                <m:r>
+                  <m:t>0.08</m:t>
+                </m:r>
+              </m:e>
+            </m:d>
+            <m:r>
+              <m:rPr>
+                <m:sty m:val="p"/>
+              </m:rPr>
+              <m:t>−</m:t>
+            </m:r>
+            <m:sSub>
+              <m:e>
+                <m:r>
+                  <m:t>f</m:t>
+                </m:r>
+              </m:e>
+              <m:sub>
+                <m:r>
+                  <m:t>t</m:t>
+                </m:r>
+                <m:r>
+                  <m:rPr>
+                    <m:sty m:val="p"/>
+                  </m:rPr>
+                  <m:t>−</m:t>
+                </m:r>
+                <m:r>
+                  <m:t>1</m:t>
+                </m:r>
+              </m:sub>
+            </m:sSub>
+          </m:e>
+        </m:d>
+      </m:oMath>
+      <w:r>
+        <w:t xml:space="preserve">, where</w:t>
+      </w:r>
+      <w:r>
+        <w:t xml:space="preserve"> </w:t>
+      </w:r>
+      <m:oMath>
+        <m:r>
+          <m:t>α</m:t>
+        </m:r>
+        <m:r>
+          <m:rPr>
+            <m:sty m:val="p"/>
+          </m:rPr>
+          <m:t>=</m:t>
+        </m:r>
+        <m:r>
+          <m:t>1</m:t>
+        </m:r>
+        <m:r>
+          <m:rPr>
+            <m:sty m:val="p"/>
+          </m:rPr>
+          <m:t>−</m:t>
+        </m:r>
+        <m:sSup>
+          <m:e>
+            <m:r>
+              <m:t>e</m:t>
+            </m:r>
+          </m:e>
+          <m:sup>
+            <m:r>
+              <m:rPr>
+                <m:sty m:val="p"/>
+              </m:rPr>
+              <m:t>−</m:t>
+            </m:r>
+            <m:r>
+              <m:t>0.01</m:t>
+            </m:r>
+            <m:r>
+              <m:rPr>
+                <m:sty m:val="p"/>
+              </m:rPr>
+              <m:t>/</m:t>
+            </m:r>
+            <m:r>
+              <m:t>0.3</m:t>
+            </m:r>
+          </m:sup>
+        </m:sSup>
+      </m:oMath>
+      <w:r>
+        <w:t xml:space="preserve">. Invalid/stale packets clear</w:t>
+      </w:r>
+      <w:r>
+        <w:t xml:space="preserve"> </w:t>
+      </w:r>
+      <m:oMath>
+        <m:sSub>
+          <m:e>
+            <m:r>
+              <m:t>f</m:t>
+            </m:r>
+          </m:e>
+          <m:sub>
+            <m:r>
+              <m:t>t</m:t>
+            </m:r>
+          </m:sub>
+        </m:sSub>
+      </m:oMath>
+      <w:r>
+        <w:t xml:space="preserve">, authority and the recovery count. Valid performance rejection keeps filter history while revoking authority.</w:t>
+      </w:r>
+    </w:p>
+    <w:p>
+      <w:pPr>
+        <w:pStyle w:val="BodyText"/>
+      </w:pPr>
+      <m:oMathPara>
+        <m:oMathParaPr>
+          <m:jc m:val="center"/>
+        </m:oMathParaPr>
+        <m:oMath>
+          <m:sSub>
+            <m:e>
+              <m:r>
+                <m:t>δ</m:t>
+              </m:r>
+            </m:e>
+            <m:sub>
+              <m:r>
+                <m:rPr>
+                  <m:sty m:val="p"/>
+                </m:rPr>
+                <m:t>c</m:t>
+              </m:r>
+              <m:r>
+                <m:rPr>
+                  <m:sty m:val="p"/>
+                </m:rPr>
+                <m:t>m</m:t>
+              </m:r>
+              <m:r>
+                <m:rPr>
+                  <m:sty m:val="p"/>
+                </m:rPr>
+                <m:t>d</m:t>
+              </m:r>
+              <m:r>
+                <m:rPr>
+                  <m:sty m:val="p"/>
+                </m:rPr>
+                <m:t>,</m:t>
+              </m:r>
+              <m:r>
+                <m:t>t</m:t>
+              </m:r>
+            </m:sub>
+          </m:sSub>
+          <m:r>
+            <m:rPr>
+              <m:sty m:val="p"/>
+            </m:rPr>
+            <m:t>=</m:t>
+          </m:r>
+          <m:r>
+            <m:rPr>
+              <m:sty m:val="p"/>
+            </m:rPr>
+            <m:t>clip</m:t>
+          </m:r>
+          <m:d>
+            <m:dPr>
+              <m:begChr m:val="("/>
+              <m:endChr m:val=")"/>
+              <m:sepChr m:val=""/>
+              <m:grow/>
+            </m:dPr>
+            <m:e>
+              <m:sSub>
+                <m:e>
+                  <m:r>
+                    <m:t>δ</m:t>
+                  </m:r>
+                </m:e>
+                <m:sub>
+                  <m:r>
+                    <m:rPr>
+                      <m:sty m:val="p"/>
+                    </m:rPr>
+                    <m:t>L</m:t>
+                  </m:r>
+                  <m:r>
+                    <m:rPr>
+                      <m:sty m:val="p"/>
+                    </m:rPr>
+                    <m:t>Q</m:t>
+                  </m:r>
+                  <m:r>
+                    <m:rPr>
+                      <m:sty m:val="p"/>
+                    </m:rPr>
+                    <m:t>R</m:t>
+                  </m:r>
+                  <m:r>
+                    <m:rPr>
+                      <m:sty m:val="p"/>
+                    </m:rPr>
+                    <m:t>,</m:t>
+                  </m:r>
+                  <m:r>
+                    <m:t>t</m:t>
+                  </m:r>
+                </m:sub>
+              </m:sSub>
+              <m:r>
+                <m:rPr>
+                  <m:sty m:val="p"/>
+                </m:rPr>
+                <m:t>+</m:t>
+              </m:r>
+              <m:sSub>
+                <m:e>
+                  <m:r>
+                    <m:t>w</m:t>
+                  </m:r>
+                </m:e>
+                <m:sub>
+                  <m:r>
+                    <m:t>t</m:t>
+                  </m:r>
+                </m:sub>
+              </m:sSub>
+              <m:sSub>
+                <m:e>
+                  <m:r>
+                    <m:t>f</m:t>
+                  </m:r>
+                </m:e>
+                <m:sub>
+                  <m:r>
+                    <m:t>t</m:t>
+                  </m:r>
+                </m:sub>
+              </m:sSub>
+              <m:r>
+                <m:rPr>
+                  <m:sty m:val="p"/>
+                </m:rPr>
+                <m:t>,</m:t>
+              </m:r>
+              <m:r>
+                <m:rPr>
+                  <m:sty m:val="p"/>
+                </m:rPr>
+                <m:t>−</m:t>
+              </m:r>
+              <m:r>
+                <m:t>0.5</m:t>
+              </m:r>
+              <m:r>
+                <m:rPr>
+                  <m:sty m:val="p"/>
+                </m:rPr>
+                <m:t>,</m:t>
+              </m:r>
+              <m:r>
+                <m:t>0.5</m:t>
+              </m:r>
+            </m:e>
+          </m:d>
+          <m:r>
+            <m:rPr>
+              <m:sty m:val="p"/>
+            </m:rPr>
+            <m:t>.</m:t>
+          </m:r>
+        </m:oMath>
+      </m:oMathPara>
+    </w:p>
+    <w:p>
+      <w:pPr>
+        <w:pStyle w:val="FirstParagraph"/>
+      </w:pPr>
+      <m:oMathPara>
+        <m:oMathParaPr>
+          <m:jc m:val="center"/>
+        </m:oMathParaPr>
+        <m:oMath>
+          <m:r>
+            <m:t>0</m:t>
+          </m:r>
+          <m:r>
+            <m:rPr>
+              <m:sty m:val="p"/>
+            </m:rPr>
+            <m:t>≤</m:t>
+          </m:r>
+          <m:sSub>
+            <m:e>
+              <m:r>
+                <m:t>a</m:t>
+              </m:r>
+            </m:e>
+            <m:sub>
+              <m:r>
+                <m:t>t</m:t>
+              </m:r>
+            </m:sub>
+          </m:sSub>
+          <m:r>
+            <m:rPr>
+              <m:sty m:val="p"/>
+            </m:rPr>
+            <m:t>&lt;</m:t>
+          </m:r>
+          <m:r>
+            <m:t>0.05</m:t>
+          </m:r>
+          <m:r>
+            <m:t> </m:t>
+          </m:r>
+          <m:r>
+            <m:rPr>
+              <m:sty m:val="p"/>
+            </m:rPr>
+            <m:t>s</m:t>
+          </m:r>
+          <m:r>
+            <m:rPr>
+              <m:sty m:val="p"/>
+            </m:rPr>
+            <m:t>,</m:t>
+          </m:r>
+          <m:r>
+            <m:t>  </m:t>
+          </m:r>
+          <m:sSub>
+            <m:e>
+              <m:r>
+                <m:t>J</m:t>
+              </m:r>
+            </m:e>
+            <m:sub>
+              <m:r>
+                <m:t>0</m:t>
+              </m:r>
+            </m:sub>
+          </m:sSub>
+          <m:r>
+            <m:rPr>
+              <m:sty m:val="p"/>
+            </m:rPr>
+            <m:t>−</m:t>
+          </m:r>
+          <m:sSub>
+            <m:e>
+              <m:r>
+                <m:t>J</m:t>
+              </m:r>
+            </m:e>
+            <m:sub>
+              <m:r>
+                <m:t>1</m:t>
+              </m:r>
+            </m:sub>
+          </m:sSub>
+          <m:r>
+            <m:rPr>
+              <m:sty m:val="p"/>
+            </m:rPr>
+            <m:t>≥</m:t>
+          </m:r>
+          <m:r>
+            <m:rPr>
+              <m:sty m:val="p"/>
+            </m:rPr>
+            <m:t>max</m:t>
+          </m:r>
+          <m:d>
+            <m:dPr>
+              <m:begChr m:val="("/>
+              <m:endChr m:val=")"/>
+              <m:sepChr m:val=""/>
+              <m:grow/>
+            </m:dPr>
+            <m:e>
+              <m:sSup>
+                <m:e>
+                  <m:r>
+                    <m:t>10</m:t>
+                  </m:r>
+                </m:e>
+                <m:sup>
+                  <m:r>
+                    <m:rPr>
+                      <m:sty m:val="p"/>
+                    </m:rPr>
+                    <m:t>−</m:t>
+                  </m:r>
+                  <m:r>
+                    <m:t>7</m:t>
+                  </m:r>
+                </m:sup>
+              </m:sSup>
+              <m:r>
+                <m:rPr>
+                  <m:sty m:val="p"/>
+                </m:rPr>
+                <m:t>,</m:t>
+              </m:r>
+              <m:r>
+                <m:t>0.001</m:t>
+              </m:r>
+              <m:sSub>
+                <m:e>
+                  <m:r>
+                    <m:t>J</m:t>
+                  </m:r>
+                </m:e>
+                <m:sub>
+                  <m:r>
+                    <m:t>0</m:t>
+                  </m:r>
+                </m:sub>
+              </m:sSub>
+            </m:e>
+          </m:d>
+          <m:r>
+            <m:rPr>
+              <m:sty m:val="p"/>
+            </m:rPr>
+            <m:t>.</m:t>
+          </m:r>
+        </m:oMath>
+      </m:oMathPara>
+    </w:p>
+    <w:p>
+      <w:pPr>
+        <w:pStyle w:val="FirstParagraph"/>
+      </w:pPr>
+      <w:r>
+        <w:t xml:space="preserve">After three consecutive good control ticks,</w:t>
+      </w:r>
+      <w:r>
+        <w:t xml:space="preserve"> </w:t>
+      </w:r>
+      <m:oMath>
+        <m:sSub>
+          <m:e>
+            <m:r>
+              <m:t>w</m:t>
+            </m:r>
+          </m:e>
+          <m:sub>
+            <m:r>
+              <m:t>t</m:t>
+            </m:r>
+          </m:sub>
+        </m:sSub>
+        <m:r>
+          <m:rPr>
+            <m:sty m:val="p"/>
+          </m:rPr>
+          <m:t>=</m:t>
+        </m:r>
+        <m:r>
+          <m:rPr>
+            <m:sty m:val="p"/>
+          </m:rPr>
+          <m:t>min</m:t>
+        </m:r>
+        <m:d>
+          <m:dPr>
+            <m:begChr m:val="("/>
+            <m:endChr m:val=")"/>
+            <m:sepChr m:val=""/>
+            <m:grow/>
+          </m:dPr>
+          <m:e>
+            <m:r>
+              <m:t>0.25</m:t>
+            </m:r>
+            <m:r>
+              <m:rPr>
+                <m:sty m:val="p"/>
+              </m:rPr>
+              <m:t>,</m:t>
+            </m:r>
+            <m:sSub>
+              <m:e>
+                <m:r>
+                  <m:t>w</m:t>
+                </m:r>
+              </m:e>
+              <m:sub>
+                <m:r>
+                  <m:t>t</m:t>
+                </m:r>
+                <m:r>
+                  <m:rPr>
+                    <m:sty m:val="p"/>
+                  </m:rPr>
+                  <m:t>−</m:t>
+                </m:r>
+                <m:r>
+                  <m:t>1</m:t>
+                </m:r>
+              </m:sub>
+            </m:sSub>
+            <m:r>
+              <m:rPr>
+                <m:sty m:val="p"/>
+              </m:rPr>
+              <m:t>+</m:t>
+            </m:r>
+            <m:r>
+              <m:t>0.05</m:t>
+            </m:r>
+          </m:e>
+        </m:d>
+      </m:oMath>
+      <w:r>
+        <w:t xml:space="preserve">; otherwise</w:t>
+      </w:r>
+      <w:r>
+        <w:t xml:space="preserve"> </w:t>
+      </w:r>
+      <m:oMath>
+        <m:sSub>
+          <m:e>
+            <m:r>
+              <m:t>w</m:t>
+            </m:r>
+          </m:e>
+          <m:sub>
+            <m:r>
+              <m:t>t</m:t>
+            </m:r>
+          </m:sub>
+        </m:sSub>
+        <m:r>
+          <m:rPr>
+            <m:sty m:val="p"/>
+          </m:rPr>
+          <m:t>=</m:t>
+        </m:r>
+        <m:r>
+          <m:t>0</m:t>
+        </m:r>
+      </m:oMath>
+      <w:r>
+        <w:t xml:space="preserve">. Three control ticks need not contain three distinct worker replies. LQR always contributes: this is residual assistance, not full-command PPO/LQR switching.</w:t>
       </w:r>
       <w:r>
         <w:t xml:space="preserve"> </w:t>

</xml_diff>